<commit_message>
Update README, report and sample log
</commit_message>
<xml_diff>
--- a/part2_python/REPORT.docx
+++ b/part2_python/REPORT.docx
@@ -95,7 +95,7 @@
         <w:t xml:space="preserve"> </w:t>
       </w:r>
       <w:r>
-        <w:t xml:space="preserve">so the processing can be audited.</w:t>
+        <w:t xml:space="preserve">so the processing can be audited, and every data rule matches the Part 1 SQL view so the two parts report the same numbers.</w:t>
       </w:r>
     </w:p>
     <w:bookmarkEnd w:id="20"/>
@@ -162,7 +162,7 @@
         <w:t xml:space="preserve">"No Holiday"</w:t>
       </w:r>
       <w:r>
-        <w:t xml:space="preserve">. It is a real value, not a missing one (a Part 1 finding).</w:t>
+        <w:t xml:space="preserve">. It is a real value, not a missing one.</w:t>
       </w:r>
     </w:p>
     <w:p>
@@ -186,32 +186,48 @@
         <w:pStyle w:val="Compact"/>
       </w:pPr>
       <w:r>
-        <w:t xml:space="preserve">Drops 7,612 rows that repeat an hour already recorded. These carry extra weather labels but the same traffic</w:t>
-      </w:r>
-      <w:r>
-        <w:t xml:space="preserve"> </w:t>
-      </w:r>
-      <w:r>
-        <w:t xml:space="preserve">count, so keeping the first row per hour loses no traffic information. This leaves</w:t>
-      </w:r>
-      <w:r>
-        <w:t xml:space="preserve"> </w:t>
-      </w:r>
-      <w:r>
         <w:rPr>
           <w:bCs/>
           <w:b/>
         </w:rPr>
+        <w:t xml:space="preserve">Collapses to one row per hour.</w:t>
+      </w:r>
+      <w:r>
+        <w:t xml:space="preserve"> </w:t>
+      </w:r>
+      <w:r>
+        <w:t xml:space="preserve">A further 7,612 rows repeat an hour already recorded. They carry extra weather</w:t>
+      </w:r>
+      <w:r>
+        <w:t xml:space="preserve"> </w:t>
+      </w:r>
+      <w:r>
+        <w:t xml:space="preserve">labels but identical traffic, so we keep the row with the most severe weather (Thunderstorm &gt; Squall &gt; Snow &gt;</w:t>
+      </w:r>
+      <w:r>
+        <w:t xml:space="preserve"> </w:t>
+      </w:r>
+      <w:r>
+        <w:t xml:space="preserve">Rain &gt; Drizzle &gt; Fog &gt; Mist &gt; Haze &gt; Smoke &gt; Clouds &gt; Clear). This leaves</w:t>
+      </w:r>
+      <w:r>
+        <w:t xml:space="preserve"> </w:t>
+      </w:r>
+      <w:r>
+        <w:rPr>
+          <w:bCs/>
+          <w:b/>
+        </w:rPr>
         <w:t xml:space="preserve">40,575 hourly records</w:t>
       </w:r>
       <w:r>
-        <w:t xml:space="preserve">,</w:t>
-      </w:r>
-      <w:r>
-        <w:t xml:space="preserve"> </w:t>
-      </w:r>
-      <w:r>
-        <w:t xml:space="preserve">matching the 40,575 distinct timestamps found in Part 1.</w:t>
+        <w:t xml:space="preserve">, and a check</w:t>
+      </w:r>
+      <w:r>
+        <w:t xml:space="preserve"> </w:t>
+      </w:r>
+      <w:r>
+        <w:t xml:space="preserve">confirms every timestamp is unique.</w:t>
       </w:r>
     </w:p>
     <w:p>
@@ -223,93 +239,170 @@
         <w:pStyle w:val="Compact"/>
       </w:pPr>
       <w:r>
-        <w:t xml:space="preserve">Replaces 10 impossible 0 K temperatures and one 9,831 mm rainfall reading with the median of valid readings in</w:t>
-      </w:r>
-      <w:r>
-        <w:t xml:space="preserve"> </w:t>
-      </w:r>
-      <w:r>
-        <w:t xml:space="preserve">the same calendar month, calculated month by month rather than with one global average.</w:t>
-      </w:r>
-    </w:p>
-    <w:p>
-      <w:pPr>
-        <w:pStyle w:val="FirstParagraph"/>
-      </w:pPr>
-      <w:r>
-        <w:t xml:space="preserve">Each step writes its own log line with the number of rows affected and the reason.</w:t>
-      </w:r>
-    </w:p>
-    <w:p>
-      <w:pPr>
-        <w:pStyle w:val="BodyText"/>
-      </w:pPr>
-      <w:r>
         <w:rPr>
           <w:bCs/>
           <w:b/>
         </w:rPr>
-        <w:t xml:space="preserve">Features.</w:t>
-      </w:r>
-      <w:r>
-        <w:t xml:space="preserve"> </w:t>
-      </w:r>
-      <w:r>
-        <w:t xml:space="preserve">The cleaned data gains 34 columns (43 in total): hour, day of week, month, weekend and rush-hour</w:t>
-      </w:r>
-      <w:r>
-        <w:t xml:space="preserve"> </w:t>
-      </w:r>
-      <w:r>
-        <w:t xml:space="preserve">flags, sine/cosine pairs for hour, day of week and month (so 23:00 sits next to 00:00), a holiday flag, temperature</w:t>
-      </w:r>
-      <w:r>
-        <w:t xml:space="preserve"> </w:t>
-      </w:r>
-      <w:r>
-        <w:t xml:space="preserve">in °C, rain, snow, low-visibility, precipitation and severe-weather flags, one-hot weather categories, and scaled</w:t>
-      </w:r>
-      <w:r>
-        <w:t xml:space="preserve"> </w:t>
-      </w:r>
-      <w:r>
-        <w:t xml:space="preserve">versions of temperature (z-score), cloud cover and rainfall (0–1).</w:t>
-      </w:r>
-    </w:p>
-    <w:p>
-      <w:pPr>
-        <w:pStyle w:val="BodyText"/>
-      </w:pPr>
+        <w:t xml:space="preserve">Fills the holiday flag across the whole day.</w:t>
+      </w:r>
+      <w:r>
+        <w:t xml:space="preserve"> </w:t>
+      </w:r>
+      <w:r>
+        <w:t xml:space="preserve">Only 00:00 was flagged (53 hours), so the flag carried almost no signal. It</w:t>
+      </w:r>
+      <w:r>
+        <w:t xml:space="preserve"> </w:t>
+      </w:r>
+      <w:r>
+        <w:t xml:space="preserve">now covers</w:t>
+      </w:r>
+      <w:r>
+        <w:t xml:space="preserve"> </w:t>
+      </w:r>
       <w:r>
         <w:rPr>
           <w:bCs/>
           <w:b/>
         </w:rPr>
-        <w:t xml:space="preserve">Congestion category.</w:t>
-      </w:r>
-      <w:r>
-        <w:t xml:space="preserve"> </w:t>
-      </w:r>
-      <w:r>
-        <w:t xml:space="preserve">The 25th, 50th and 75th percentiles of traffic volume (1,248 / 3,427 / 4,952 vehicles</w:t>
-      </w:r>
-      <w:r>
-        <w:t xml:space="preserve"> </w:t>
-      </w:r>
-      <w:r>
-        <w:t xml:space="preserve">per hour) split the hours into Low, Medium, High and Severe, each holding about a quarter of the data. The</w:t>
-      </w:r>
-      <w:r>
-        <w:t xml:space="preserve"> </w:t>
-      </w:r>
-      <w:r>
-        <w:t xml:space="preserve">thresholds come from the data, so no hand-picked cut-off is needed. This differs from the fixed 5,500 line used on the</w:t>
-      </w:r>
-      <w:r>
-        <w:t xml:space="preserve"> </w:t>
-      </w:r>
-      <w:r>
-        <w:t xml:space="preserve">Part 1 dashboard, because the capstone instructions ask for quartiles here.</w:t>
+        <w:t xml:space="preserve">1,203 hours across 53 holiday dates</w:t>
+      </w:r>
+      <w:r>
+        <w:t xml:space="preserve">.</w:t>
+      </w:r>
+    </w:p>
+    <w:p>
+      <w:pPr>
+        <w:numPr>
+          <w:ilvl w:val="0"/>
+          <w:numId w:val="1001"/>
+        </w:numPr>
+        <w:pStyle w:val="Compact"/>
+      </w:pPr>
+      <w:r>
+        <w:t xml:space="preserve">Replaces 10 impossible 0 K temperatures and one 9,831 mm rainfall reading with the median of valid readings in</w:t>
+      </w:r>
+      <w:r>
+        <w:t xml:space="preserve"> </w:t>
+      </w:r>
+      <w:r>
+        <w:t xml:space="preserve">the same calendar month, and 2 zero-traffic hours (23 July 2016, 18:00 and 23:00, sensor dropouts) with the median</w:t>
+      </w:r>
+      <w:r>
+        <w:t xml:space="preserve"> </w:t>
+      </w:r>
+      <w:r>
+        <w:t xml:space="preserve">for the same month and hour. Each is calculated group by group in a loop, not with one global average.</w:t>
+      </w:r>
+    </w:p>
+    <w:p>
+      <w:pPr>
+        <w:pStyle w:val="FirstParagraph"/>
+      </w:pPr>
+      <w:r>
+        <w:t xml:space="preserve">Each step writes its own log line with the number of rows affected and the reason.</w:t>
+      </w:r>
+    </w:p>
+    <w:p>
+      <w:pPr>
+        <w:pStyle w:val="BodyText"/>
+      </w:pPr>
+      <w:r>
+        <w:rPr>
+          <w:bCs/>
+          <w:b/>
+        </w:rPr>
+        <w:t xml:space="preserve">Reconciliation with Part 1.</w:t>
+      </w:r>
+      <w:r>
+        <w:t xml:space="preserve"> </w:t>
+      </w:r>
+      <w:r>
+        <w:t xml:space="preserve">Compared hour by hour with the SQL view, the Python output has the same 40,575</w:t>
+      </w:r>
+      <w:r>
+        <w:t xml:space="preserve"> </w:t>
+      </w:r>
+      <w:r>
+        <w:t xml:space="preserve">hours, the same weather label and holiday label for every hour, and the same 6,107 hours above 5,500 vehicles. The</w:t>
+      </w:r>
+      <w:r>
+        <w:t xml:space="preserve"> </w:t>
+      </w:r>
+      <w:r>
+        <w:t xml:space="preserve">only differences are the 13 repaired values, which move the mean from 3,290.65 to 3,290.79.</w:t>
+      </w:r>
+    </w:p>
+    <w:p>
+      <w:pPr>
+        <w:pStyle w:val="BodyText"/>
+      </w:pPr>
+      <w:r>
+        <w:rPr>
+          <w:bCs/>
+          <w:b/>
+        </w:rPr>
+        <w:t xml:space="preserve">Features.</w:t>
+      </w:r>
+      <w:r>
+        <w:t xml:space="preserve"> </w:t>
+      </w:r>
+      <w:r>
+        <w:t xml:space="preserve">The cleaned data gains 34 columns (43 in total): hour, day of week, month, weekend and rush-hour</w:t>
+      </w:r>
+      <w:r>
+        <w:t xml:space="preserve"> </w:t>
+      </w:r>
+      <w:r>
+        <w:t xml:space="preserve">flags, sine/cosine pairs for hour, day of week and month (so 23:00 sits next to 00:00), a holiday flag, temperature</w:t>
+      </w:r>
+      <w:r>
+        <w:t xml:space="preserve"> </w:t>
+      </w:r>
+      <w:r>
+        <w:t xml:space="preserve">in °C, rain, snow, low-visibility, precipitation and severe-weather flags, one-hot weather categories, and scaled</w:t>
+      </w:r>
+      <w:r>
+        <w:t xml:space="preserve"> </w:t>
+      </w:r>
+      <w:r>
+        <w:t xml:space="preserve">versions of temperature (z-score), cloud cover and rainfall (0–1).</w:t>
+      </w:r>
+    </w:p>
+    <w:p>
+      <w:pPr>
+        <w:pStyle w:val="BodyText"/>
+      </w:pPr>
+      <w:r>
+        <w:rPr>
+          <w:bCs/>
+          <w:b/>
+        </w:rPr>
+        <w:t xml:space="preserve">Three congestion definitions, kept distinct.</w:t>
+      </w:r>
+      <w:r>
+        <w:t xml:space="preserve"> </w:t>
+      </w:r>
+      <w:r>
+        <w:t xml:space="preserve">Policy-facing: volume above 5,500 (15.1% of hours). Dashboard-facing:</w:t>
+      </w:r>
+      <w:r>
+        <w:t xml:space="preserve"> </w:t>
+      </w:r>
+      <w:r>
+        <w:t xml:space="preserve">bands at 4,500 and 5,500. Modelling construct: quartiles of volume (1,249 / 3,428 / 4,952) giving Low, Medium,</w:t>
+      </w:r>
+      <w:r>
+        <w:t xml:space="preserve"> </w:t>
+      </w:r>
+      <w:r>
+        <w:t xml:space="preserve">High and Severe with about a quarter of the hours each. The cut-offs come from the data, so no hand-picked</w:t>
+      </w:r>
+      <w:r>
+        <w:t xml:space="preserve"> </w:t>
+      </w:r>
+      <w:r>
+        <w:t xml:space="preserve">number is needed for the target.</w:t>
       </w:r>
     </w:p>
     <w:bookmarkEnd w:id="21"/>
@@ -397,7 +490,7 @@
         <w:t xml:space="preserve"> </w:t>
       </w:r>
       <w:r>
-        <w:t xml:space="preserve">Cloudy and hazy hours average about 3,600 vehicles/hour, fog about 2,700. Weather type is tied to</w:t>
+        <w:t xml:space="preserve">Cloudy and hazy hours average 3,600–3,700 vehicles/hour, fog about 2,650. Weather type is tied to</w:t>
       </w:r>
       <w:r>
         <w:t xml:space="preserve"> </w:t>
@@ -425,7 +518,7 @@
         <w:t xml:space="preserve"> </w:t>
       </w:r>
       <w:r>
-        <w:t xml:space="preserve">Correlation with traffic is about 0.14 on the cleaned data, a weak link that agrees with Part 1.</w:t>
+        <w:t xml:space="preserve">Correlation with traffic is about 0.14, a weak link that agrees with Part 1.</w:t>
       </w:r>
     </w:p>
     <w:p>
@@ -545,13 +638,13 @@
         <w:t xml:space="preserve">weather</w:t>
       </w:r>
       <w:r>
-        <w:t xml:space="preserve">). It logs each command with</w:t>
-      </w:r>
-      <w:r>
-        <w:t xml:space="preserve"> </w:t>
-      </w:r>
-      <w:r>
-        <w:t xml:space="preserve">its arguments and reports invalid input, such as a malformed date, as a clear ERROR without a traceback.</w:t>
+        <w:t xml:space="preserve">). It logs each</w:t>
+      </w:r>
+      <w:r>
+        <w:t xml:space="preserve"> </w:t>
+      </w:r>
+      <w:r>
+        <w:t xml:space="preserve">command with its arguments and reports invalid input, such as a malformed date, as a clear ERROR without a traceback.</w:t>
       </w:r>
     </w:p>
     <w:bookmarkEnd w:id="23"/>
@@ -573,7 +666,13 @@
         <w:pStyle w:val="Compact"/>
       </w:pPr>
       <w:r>
-        <w:t xml:space="preserve">The data has gaps (for example August 2014 to June 2015), so a query for a missing hour returns a clear message.</w:t>
+        <w:t xml:space="preserve">About nine months are missing (September 2014 to May 2015), so a query for a missing hour returns a clear message</w:t>
+      </w:r>
+      <w:r>
+        <w:t xml:space="preserve"> </w:t>
+      </w:r>
+      <w:r>
+        <w:t xml:space="preserve">and yearly totals reflect coverage, not demand.</w:t>
       </w:r>
     </w:p>
     <w:p>
@@ -585,7 +684,13 @@
         <w:pStyle w:val="Compact"/>
       </w:pPr>
       <w:r>
-        <w:t xml:space="preserve">Keeping the first row per repeated hour is a simplification. The weather label of the other rows is discarded.</w:t>
+        <w:t xml:space="preserve">Keeping one weather label per hour discards the less severe labels. This favours bad-weather hours and is stated</w:t>
+      </w:r>
+      <w:r>
+        <w:t xml:space="preserve"> </w:t>
+      </w:r>
+      <w:r>
+        <w:t xml:space="preserve">so Part 3 can account for it.</w:t>
       </w:r>
     </w:p>
     <w:p>
@@ -597,7 +702,7 @@
         <w:pStyle w:val="Compact"/>
       </w:pPr>
       <w:r>
-        <w:t xml:space="preserve">Smoke (15 hours) and squall (1 hour) are too rare for reliable averages; the weather chart leaves them out.</w:t>
+        <w:t xml:space="preserve">Smoke (2 hours) and squall (1 hour) are too rare for reliable averages; the weather chart leaves them out.</w:t>
       </w:r>
     </w:p>
     <w:p>
@@ -609,7 +714,13 @@
         <w:pStyle w:val="Compact"/>
       </w:pPr>
       <w:r>
-        <w:t xml:space="preserve">The 23 July 2016 anomaly flagged in Part 1 is kept in the data and still needs checking with the data owner.</w:t>
+        <w:t xml:space="preserve">The 23 July 2016 anomaly (very low traffic all day) remains in the data apart from the two zero readings and still</w:t>
+      </w:r>
+      <w:r>
+        <w:t xml:space="preserve"> </w:t>
+      </w:r>
+      <w:r>
+        <w:t xml:space="preserve">needs checking with the data owner.</w:t>
       </w:r>
     </w:p>
     <w:p>
@@ -621,7 +732,7 @@
         <w:pStyle w:val="Compact"/>
       </w:pPr>
       <w:r>
-        <w:t xml:space="preserve">Part 3 will use</w:t>
+        <w:t xml:space="preserve">Part 3 uses</w:t>
       </w:r>
       <w:r>
         <w:t xml:space="preserve"> </w:t>
@@ -630,16 +741,37 @@
         <w:rPr>
           <w:rStyle w:val="VerbatimChar"/>
         </w:rPr>
+        <w:t xml:space="preserve">traffic_clean.csv</w:t>
+      </w:r>
+      <w:r>
+        <w:t xml:space="preserve"> </w:t>
+      </w:r>
+      <w:r>
+        <w:t xml:space="preserve">and</w:t>
+      </w:r>
+      <w:r>
+        <w:t xml:space="preserve"> </w:t>
+      </w:r>
+      <w:r>
+        <w:rPr>
+          <w:rStyle w:val="VerbatimChar"/>
+        </w:rPr>
         <w:t xml:space="preserve">traffic_features.csv</w:t>
       </w:r>
       <w:r>
-        <w:t xml:space="preserve">, including the congestion category and the low-visibility and</w:t>
-      </w:r>
-      <w:r>
-        <w:t xml:space="preserve"> </w:t>
-      </w:r>
-      <w:r>
-        <w:t xml:space="preserve">severe-weather flags, for the models.</w:t>
+        <w:t xml:space="preserve">, the shared weather groups and the seed in</w:t>
+      </w:r>
+      <w:r>
+        <w:t xml:space="preserve"> </w:t>
+      </w:r>
+      <w:r>
+        <w:rPr>
+          <w:rStyle w:val="VerbatimChar"/>
+        </w:rPr>
+        <w:t xml:space="preserve">config.py</w:t>
+      </w:r>
+      <w:r>
+        <w:t xml:space="preserve">.</w:t>
       </w:r>
     </w:p>
     <w:bookmarkEnd w:id="24"/>

</xml_diff>

<commit_message>
Correct outage window; clarify pooling, features and scaling
</commit_message>
<xml_diff>
--- a/part2_python/REPORT.docx
+++ b/part2_python/REPORT.docx
@@ -280,20 +280,12 @@
         <w:pStyle w:val="Compact"/>
       </w:pPr>
       <w:r>
-        <w:t xml:space="preserve">Replaces 10 impossible 0 K temperatures and one 9,831 mm rainfall reading with the median of valid readings in</w:t>
-      </w:r>
-      <w:r>
-        <w:t xml:space="preserve"> </w:t>
-      </w:r>
-      <w:r>
-        <w:t xml:space="preserve">the same calendar month, and 2 zero-traffic hours (23 July 2016, 18:00 and 23:00, sensor dropouts) with the median</w:t>
-      </w:r>
-      <w:r>
-        <w:t xml:space="preserve"> </w:t>
-      </w:r>
-      <w:r>
-        <w:t xml:space="preserve">for the same month and hour. Each is calculated group by group in a loop, not with one global average.</w:t>
-      </w:r>
+        <w:t>Replaces 10 impossible 0 K temperatures and one 9,831 mm rainfall reading with the median of valid readings in the same calendar month, and 2 zero-traffic hours (23 July 2016, 18:00 and 23:00, inside the outage described in Section 5) with the median for the same month and hour. Medians pool all years (every January together, and so on), and each is calculated group by group in a loop, not with one global average.</w:t>
+      </w:r>
+      <w:r/>
+      <w:r/>
+      <w:r/>
+      <w:r/>
     </w:p>
     <w:p>
       <w:pPr>
@@ -378,32 +370,20 @@
           <w:bCs/>
           <w:b/>
         </w:rPr>
-        <w:t xml:space="preserve">Three congestion definitions, kept distinct.</w:t>
-      </w:r>
-      <w:r>
-        <w:t xml:space="preserve"> </w:t>
-      </w:r>
-      <w:r>
-        <w:t xml:space="preserve">Policy-facing: volume above 5,500 (15.1% of hours). Dashboard-facing:</w:t>
-      </w:r>
-      <w:r>
-        <w:t xml:space="preserve"> </w:t>
-      </w:r>
-      <w:r>
-        <w:t xml:space="preserve">bands at 4,500 and 5,500. Modelling construct: quartiles of volume (1,249 / 3,428 / 4,952) giving Low, Medium,</w:t>
-      </w:r>
-      <w:r>
-        <w:t xml:space="preserve"> </w:t>
-      </w:r>
-      <w:r>
-        <w:t xml:space="preserve">High and Severe with about a quarter of the hours each. The cut-offs come from the data, so no hand-picked</w:t>
-      </w:r>
-      <w:r>
-        <w:t xml:space="preserve"> </w:t>
-      </w:r>
-      <w:r>
-        <w:t xml:space="preserve">number is needed for the target.</w:t>
-      </w:r>
+        <w:t>Three congestion definitions, kept distinct.</w:t>
+      </w:r>
+      <w:r>
+        <w:t xml:space="preserve"> </w:t>
+      </w:r>
+      <w:r>
+        <w:t>Policy-facing: volume above 5,500 (15.1% of hours). Dashboard-facing: bands at 4,500 and 5,500. Modelling construct: quartiles of volume (1,249 / 3,428 / 4,952; Part 1's 1,248 / 3,427 / 4,952 predates the two zero-traffic repairs) giving Low, Medium, High and Severe with about a quarter of the hours each. The cut-offs come from the data, so no hand-picked number is needed for the target.</w:t>
+      </w:r>
+      <w:r/>
+      <w:r/>
+      <w:r/>
+      <w:r/>
+      <w:r/>
+      <w:r/>
     </w:p>
     <w:bookmarkEnd w:id="21"/>
     <w:bookmarkStart w:id="22" w:name="findings-from-the-figures"/>
@@ -714,14 +694,10 @@
         <w:pStyle w:val="Compact"/>
       </w:pPr>
       <w:r>
-        <w:t xml:space="preserve">The 23 July 2016 anomaly (very low traffic all day) remains in the data apart from the two zero readings and still</w:t>
-      </w:r>
-      <w:r>
-        <w:t xml:space="preserve"> </w:t>
-      </w:r>
-      <w:r>
-        <w:t xml:space="preserve">needs checking with the data owner.</w:t>
-      </w:r>
+        <w:t>From 22:00 on 22 July to about 17:00 on 24 July 2016 (44 hours), traffic is mostly tiny (28 hours under 100 vehicles), likely a sensor or road outage. It stays in the data apart from the two replaced zeros (placeholders). It needs checking with the data owner; Part 3 should exclude or flag the whole window.</w:t>
+      </w:r>
+      <w:r/>
+      <w:r/>
     </w:p>
     <w:p>
       <w:pPr>

</xml_diff>